<commit_message>
Document AI role and HR exclusions
</commit_message>
<xml_diff>
--- a/TrafagSalesExporter/docs/CFO_Kurzbericht_270515.docx
+++ b/TrafagSalesExporter/docs/CFO_Kurzbericht_270515.docx
@@ -2237,7 +2237,7 @@
         <w:t xml:space="preserve"> des Jahres und fehlende Perioden </w:t>
       </w:r>
       <w:r>
-        <w:t>prüfen</w:t>
+        <w:t>prÃ¼fen</w:t>
       </w:r>
       <w:r>
         <w:t>.</w:t>
@@ -2352,6 +2352,24 @@
     <w:p>
       <w:r>
         <w:t xml:space="preserve"> </w:t>
+      </w:r>
+    </w:p>
+    <w:p>
+      <w:r>
+        <w:rPr>
+          <w:b/>
+        </w:rPr>
+        <w:t>IT / Intercompany Diagnose</w:t>
+      </w:r>
+    </w:p>
+    <w:p>
+      <w:r>
+        <w:t>Bei Italien erklaert Intercompany/2nd-party einen grossen Teil der Abweichung. Mit den aktuellen Markern TRAFAG, MAGNETIC SENSE, MAGNETS SENSE, GESELLSCHAFT FUER SENSORIK und GESELLSCHAFT FUR SENSORIK reduziert sich IT von 14.704.336,29 EUR um 4.397.746,90 EUR auf 10.306.589,39 EUR. Gegen Rhino/check.xlsx Soll 7.669.840,00 EUR bleibt eine Restabweichung nach IC von +2.636.749,39 EUR.</w:t>
+      </w:r>
+    </w:p>
+    <w:p>
+      <w:r>
+        <w:t>Bewertung: Intercompany/2nd-party erklaert einen grossen Teil, aber nicht alles. Die Restabweichung muss ueber Summenlogik, Beleg/Position-Deduplizierung, Gutschriften/Storno und weitere lokale IC-Kunden oder Schreibweisen geprueft werden.</w:t>
       </w:r>
     </w:p>
     <w:sectPr>

</xml_diff>